<commit_message>
Add full-account, as-is 10GB, and local entire sample modes.
Immediate Drive transfer without quality scan, plus stress tests and setup docs.

Co-authored-by: Cursor <cursoragent@cursor.com>
</commit_message>
<xml_diff>
--- a/CLIENT_SETUP_AI_LABS_SAMPLES_LOCAL.docx
+++ b/CLIENT_SETUP_AI_LABS_SAMPLES_LOCAL.docx
@@ -3,70 +3,27 @@
 <w:document xmlns:wpc="http://schemas.microsoft.com/office/word/2010/wordprocessingCanvas" xmlns:mo="http://schemas.microsoft.com/office/mac/office/2008/main" xmlns:mc="http://schemas.openxmlformats.org/markup-compatibility/2006" xmlns:mv="urn:schemas-microsoft-com:mac:vml" xmlns:o="urn:schemas-microsoft-com:office:office" xmlns:r="http://schemas.openxmlformats.org/officeDocument/2006/relationships" xmlns:m="http://schemas.openxmlformats.org/officeDocument/2006/math" xmlns:v="urn:schemas-microsoft-com:vml" xmlns:wp14="http://schemas.microsoft.com/office/word/2010/wordprocessingDrawing" xmlns:wp="http://schemas.openxmlformats.org/drawingml/2006/wordprocessingDrawing" xmlns:w10="urn:schemas-microsoft-com:office:word" xmlns:w="http://schemas.openxmlformats.org/wordprocessingml/2006/main" xmlns:w14="http://schemas.microsoft.com/office/word/2010/wordml" xmlns:wpg="http://schemas.microsoft.com/office/word/2010/wordprocessingGroup" xmlns:wpi="http://schemas.microsoft.com/office/word/2010/wordprocessingInk" xmlns:wne="http://schemas.microsoft.com/office/word/2006/wordml" xmlns:wps="http://schemas.microsoft.com/office/word/2010/wordprocessingShape" mc:Ignorable="w14 wp14">
   <w:body>
     <w:p>
-      <w:pPr>
-        <w:pStyle w:val="Title"/>
-      </w:pPr>
       <w:r>
-        <w:t>AI Labs Sample Set — Local Dump Setup Guide</w:t>
-      </w:r>
-    </w:p>
-    <w:p>
-      <w:r>
+        <w:t># AI Labs Sample Set — Local Dump Setup Guide</w:t>
+        <w:br/>
+        <w:br/>
         <w:t>Follow every step in order. Copy each command exactly.</w:t>
-      </w:r>
-    </w:p>
-    <w:p>
-      <w:r>
-        <w:rPr>
-          <w:b/>
-        </w:rPr>
-        <w:t>This guide is for local folders only</w:t>
-      </w:r>
-      <w:r>
-        <w:t xml:space="preserve"> (no Google Drive / Gmail / Cloud Console).</w:t>
-      </w:r>
-    </w:p>
-    <w:p>
-      <w:pPr>
-        <w:pStyle w:val="Heading1"/>
-      </w:pPr>
-      <w:r>
-        <w:t>What this does</w:t>
-      </w:r>
-    </w:p>
-    <w:p>
-      <w:r>
-        <w:t xml:space="preserve">Point the tool at </w:t>
-      </w:r>
-      <w:r>
-        <w:rPr>
-          <w:b/>
-        </w:rPr>
-        <w:t>any parent folder</w:t>
-      </w:r>
-      <w:r>
-        <w:t xml:space="preserve">. It processes </w:t>
-      </w:r>
-      <w:r>
-        <w:rPr>
-          <w:b/>
-        </w:rPr>
-        <w:t>every immediate subfolder</w:t>
-      </w:r>
-      <w:r>
-        <w:t xml:space="preserve"> inside it — names do not matter.</w:t>
-      </w:r>
-    </w:p>
-    <w:p>
-      <w:pPr>
-        <w:ind w:left="216"/>
-        <w:shd w:fill="F3F4F6" w:val="clear"/>
-      </w:pPr>
-      <w:r>
-        <w:rPr>
-          <w:rFonts w:ascii="Consolas" w:hAnsi="Consolas"/>
-          <w:sz w:val="18"/>
-        </w:rPr>
+        <w:br/>
+        <w:br/>
+        <w:t>**This guide is for local folders only** (no Google Drive / Gmail / Cloud Console).</w:t>
+        <w:br/>
+        <w:br/>
+        <w:t>---</w:t>
+        <w:br/>
+        <w:br/>
+        <w:t>## What this does</w:t>
+        <w:br/>
+        <w:br/>
+        <w:t>Point the tool at **any parent folder**. It processes **every immediate subfolder** inside it — names do not matter.</w:t>
+        <w:br/>
+        <w:br/>
+        <w:t>```</w:t>
+        <w:br/>
         <w:t>company-dump/</w:t>
         <w:br/>
         <w:t xml:space="preserve">  Folder A/</w:t>
@@ -74,79 +31,33 @@
         <w:t xml:space="preserve">  Folder B/</w:t>
         <w:br/>
         <w:t xml:space="preserve">  anything-else/</w:t>
-      </w:r>
-    </w:p>
-    <w:p>
-      <w:r>
-        <w:t>From each subfolder it takes files in order (whatever comes first), up to:</w:t>
-      </w:r>
-    </w:p>
-    <w:p>
-      <w:pPr>
-        <w:pStyle w:val="ListBullet"/>
-      </w:pPr>
-      <w:r>
-        <w:rPr>
-          <w:b/>
-        </w:rPr>
-        <w:t>1000 files</w:t>
-      </w:r>
-      <w:r>
-        <w:t xml:space="preserve"> per subfolder (or fewer if the folder has less)</w:t>
-      </w:r>
-    </w:p>
-    <w:p>
-      <w:pPr>
-        <w:pStyle w:val="ListBullet"/>
-      </w:pPr>
-      <w:r>
-        <w:rPr>
-          <w:b/>
-        </w:rPr>
-        <w:t>15GB overall</w:t>
-      </w:r>
-      <w:r>
-        <w:t>, split equally across the subfolders</w:t>
-      </w:r>
-    </w:p>
-    <w:p>
-      <w:r>
-        <w:t xml:space="preserve">If a subfolder is smaller than its share / has fewer than 1000 files, </w:t>
-      </w:r>
-      <w:r>
-        <w:rPr>
-          <w:b/>
-        </w:rPr>
-        <w:t>all that fits</w:t>
-      </w:r>
-      <w:r>
-        <w:t xml:space="preserve"> is copied.</w:t>
-      </w:r>
-    </w:p>
-    <w:p>
-      <w:r>
-        <w:t xml:space="preserve">Copies land on your </w:t>
-      </w:r>
-      <w:r>
-        <w:rPr>
-          <w:b/>
-        </w:rPr>
-        <w:t>Desktop</w:t>
-      </w:r>
-      <w:r>
-        <w:t>, keeping the same subfolder names:</w:t>
-      </w:r>
-    </w:p>
-    <w:p>
-      <w:pPr>
-        <w:ind w:left="216"/>
-        <w:shd w:fill="F3F4F6" w:val="clear"/>
-      </w:pPr>
-      <w:r>
-        <w:rPr>
-          <w:rFonts w:ascii="Consolas" w:hAnsi="Consolas"/>
-          <w:sz w:val="18"/>
-        </w:rPr>
+        <w:br/>
+        <w:t>```</w:t>
+        <w:br/>
+        <w:br/>
+        <w:t>**One account as the full sample** — use `--only` with a single folder name. That copies that account's **entire** data (no 1000-file / 15GB trim):</w:t>
+        <w:br/>
+        <w:br/>
+        <w:t>```</w:t>
+        <w:br/>
+        <w:t>python tools/build_quality_sample_local.py --root ~/Downloads/company-dump --only "Folder A"</w:t>
+        <w:br/>
+        <w:t>```</w:t>
+        <w:br/>
+        <w:br/>
+        <w:t>**Multiple accounts** — from each subfolder:</w:t>
+        <w:br/>
+        <w:br/>
+        <w:t>1. Take up to **1000 files** first (or fewer if the folder has less)</w:t>
+        <w:br/>
+        <w:t>2. If the total is still under **15GB**, keep taking **more files** from those folders until 15GB is reached</w:t>
+        <w:br/>
+        <w:br/>
+        <w:t>Copies land on your **Desktop**, keeping the same subfolder names:</w:t>
+        <w:br/>
+        <w:br/>
+        <w:t>```</w:t>
+        <w:br/>
         <w:t>Desktop/AI Labs Sample Set (YYYY-MM-DD)/</w:t>
         <w:br/>
         <w:t xml:space="preserve">  Folder A/</w:t>
@@ -154,1017 +65,423 @@
         <w:t xml:space="preserve">  Folder B/</w:t>
         <w:br/>
         <w:t xml:space="preserve">  anything-else/</w:t>
-      </w:r>
-    </w:p>
-    <w:p>
-      <w:pPr>
-        <w:pStyle w:val="Heading1"/>
-      </w:pPr>
-      <w:r>
-        <w:t>Prerequisites</w:t>
-      </w:r>
-    </w:p>
-    <w:p>
-      <w:pPr>
-        <w:pStyle w:val="Heading2"/>
-      </w:pPr>
-      <w:r>
-        <w:t>1. Install Python</w:t>
-      </w:r>
-    </w:p>
-    <w:p>
-      <w:pPr>
-        <w:pStyle w:val="ListNumber"/>
-      </w:pPr>
-      <w:r>
-        <w:t xml:space="preserve">Go to: </w:t>
-      </w:r>
-      <w:r>
-        <w:rPr>
-          <w:b/>
-        </w:rPr>
-        <w:t>https://www.python.org/downloads/</w:t>
-      </w:r>
-    </w:p>
-    <w:p>
-      <w:pPr>
-        <w:pStyle w:val="ListNumber"/>
-      </w:pPr>
-      <w:r>
-        <w:t>Download and run the installer.</w:t>
-      </w:r>
-    </w:p>
-    <w:p>
-      <w:pPr>
-        <w:pStyle w:val="ListBullet"/>
-      </w:pPr>
-      <w:r>
-        <w:rPr>
-          <w:b/>
-        </w:rPr>
+        <w:br/>
+        <w:t>```</w:t>
+        <w:br/>
+        <w:br/>
+        <w:t>---</w:t>
+        <w:br/>
+        <w:br/>
+        <w:t>## Prerequisites</w:t>
+        <w:br/>
+        <w:br/>
+        <w:t>### 1. Install Python</w:t>
+        <w:br/>
+        <w:br/>
+        <w:t>1. Go to: **https://www.python.org/downloads/**</w:t>
+        <w:br/>
+        <w:t>2. Download and run the installer.</w:t>
+        <w:br/>
+        <w:t xml:space="preserve">   - **Windows:** check **"Add Python to PATH"** before Install.</w:t>
+        <w:br/>
+        <w:t>3. Verify:</w:t>
+        <w:br/>
+        <w:br/>
+        <w:t>```</w:t>
+        <w:br/>
+        <w:t>python --version</w:t>
+        <w:br/>
+        <w:t>```</w:t>
+        <w:br/>
+        <w:br/>
+        <w:t>### 2. Install Git</w:t>
+        <w:br/>
+        <w:br/>
+        <w:t>1. Go to: **https://git-scm.com/downloads**</w:t>
+        <w:br/>
+        <w:t>2. Install with defaults.</w:t>
+        <w:br/>
+        <w:t>3. Verify:</w:t>
+        <w:br/>
+        <w:br/>
+        <w:t>```</w:t>
+        <w:br/>
+        <w:t>git --version</w:t>
+        <w:br/>
+        <w:t>```</w:t>
+        <w:br/>
+        <w:br/>
+        <w:t>---</w:t>
+        <w:br/>
+        <w:br/>
+        <w:t>## Part 1 — Get the code</w:t>
+        <w:br/>
+        <w:br/>
+        <w:t>```</w:t>
+        <w:br/>
+        <w:t>cd ~</w:t>
+        <w:br/>
+        <w:t>```</w:t>
+        <w:br/>
+        <w:br/>
+        <w:t>```</w:t>
+        <w:br/>
+        <w:t>git clone https://github.com/data927/inventory-segmentor.git</w:t>
+        <w:br/>
+        <w:t>```</w:t>
+        <w:br/>
+        <w:br/>
+        <w:t>```</w:t>
+        <w:br/>
+        <w:t>cd inventory-segmentor</w:t>
+        <w:br/>
+        <w:t>```</w:t>
+        <w:br/>
+        <w:br/>
+        <w:t>```</w:t>
+        <w:br/>
+        <w:t>ls tools/build_quality_sample_local.py</w:t>
+        <w:br/>
+        <w:t>```</w:t>
+        <w:br/>
+        <w:br/>
+        <w:t>---</w:t>
+        <w:br/>
+        <w:br/>
+        <w:t>## Part 2 — Python environment</w:t>
+        <w:br/>
+        <w:br/>
+        <w:t>**Create venv**</w:t>
+        <w:br/>
+        <w:br/>
+        <w:t>Mac / Linux:</w:t>
+        <w:br/>
+        <w:t>```</w:t>
+        <w:br/>
+        <w:t>python3 -m venv .venv</w:t>
+        <w:br/>
+        <w:t>```</w:t>
+        <w:br/>
+        <w:br/>
         <w:t>Windows:</w:t>
-      </w:r>
-      <w:r>
-        <w:t xml:space="preserve"> check </w:t>
-      </w:r>
-      <w:r>
-        <w:rPr>
-          <w:b/>
-        </w:rPr>
-        <w:t>"Add Python to PATH"</w:t>
-      </w:r>
-      <w:r>
-        <w:t xml:space="preserve"> before Install.</w:t>
-      </w:r>
-    </w:p>
-    <w:p>
-      <w:pPr>
-        <w:pStyle w:val="ListNumber"/>
-      </w:pPr>
-      <w:r>
-        <w:t>Verify:</w:t>
-      </w:r>
-    </w:p>
-    <w:p>
-      <w:pPr>
-        <w:ind w:left="216"/>
-        <w:shd w:fill="F3F4F6" w:val="clear"/>
-      </w:pPr>
-      <w:r>
-        <w:rPr>
-          <w:rFonts w:ascii="Consolas" w:hAnsi="Consolas"/>
-          <w:sz w:val="18"/>
-        </w:rPr>
-        <w:t>python --version</w:t>
-      </w:r>
-    </w:p>
-    <w:p>
-      <w:pPr>
-        <w:pStyle w:val="Heading2"/>
-      </w:pPr>
-      <w:r>
-        <w:t>2. Install Git</w:t>
-      </w:r>
-    </w:p>
-    <w:p>
-      <w:pPr>
-        <w:pStyle w:val="ListNumber"/>
-      </w:pPr>
-      <w:r>
-        <w:t xml:space="preserve">Go to: </w:t>
-      </w:r>
-      <w:r>
-        <w:rPr>
-          <w:b/>
-        </w:rPr>
-        <w:t>https://git-scm.com/downloads</w:t>
-      </w:r>
-    </w:p>
-    <w:p>
-      <w:pPr>
-        <w:pStyle w:val="ListNumber"/>
-      </w:pPr>
-      <w:r>
-        <w:t>Install with defaults.</w:t>
-      </w:r>
-    </w:p>
-    <w:p>
-      <w:pPr>
-        <w:pStyle w:val="ListNumber"/>
-      </w:pPr>
-      <w:r>
-        <w:t>Verify:</w:t>
-      </w:r>
-    </w:p>
-    <w:p>
-      <w:pPr>
-        <w:ind w:left="216"/>
-        <w:shd w:fill="F3F4F6" w:val="clear"/>
-      </w:pPr>
-      <w:r>
-        <w:rPr>
-          <w:rFonts w:ascii="Consolas" w:hAnsi="Consolas"/>
-          <w:sz w:val="18"/>
-        </w:rPr>
-        <w:t>git --version</w:t>
-      </w:r>
-    </w:p>
-    <w:p>
-      <w:pPr>
-        <w:pStyle w:val="Heading1"/>
-      </w:pPr>
-      <w:r>
-        <w:t>Part 1 — Get the code</w:t>
-      </w:r>
-    </w:p>
-    <w:p>
-      <w:pPr>
-        <w:ind w:left="216"/>
-        <w:shd w:fill="F3F4F6" w:val="clear"/>
-      </w:pPr>
-      <w:r>
-        <w:rPr>
-          <w:rFonts w:ascii="Consolas" w:hAnsi="Consolas"/>
-          <w:sz w:val="18"/>
-        </w:rPr>
-        <w:t>cd ~</w:t>
-      </w:r>
-    </w:p>
-    <w:p>
-      <w:pPr>
-        <w:ind w:left="216"/>
-        <w:shd w:fill="F3F4F6" w:val="clear"/>
-      </w:pPr>
-      <w:r>
-        <w:rPr>
-          <w:rFonts w:ascii="Consolas" w:hAnsi="Consolas"/>
-          <w:sz w:val="18"/>
-        </w:rPr>
-        <w:t>git clone https://github.com/data927/inventory-segmentor.git</w:t>
-      </w:r>
-    </w:p>
-    <w:p>
-      <w:pPr>
-        <w:ind w:left="216"/>
-        <w:shd w:fill="F3F4F6" w:val="clear"/>
-      </w:pPr>
-      <w:r>
-        <w:rPr>
-          <w:rFonts w:ascii="Consolas" w:hAnsi="Consolas"/>
-          <w:sz w:val="18"/>
-        </w:rPr>
-        <w:t>cd inventory-segmentor</w:t>
-      </w:r>
-    </w:p>
-    <w:p>
-      <w:pPr>
-        <w:ind w:left="216"/>
-        <w:shd w:fill="F3F4F6" w:val="clear"/>
-      </w:pPr>
-      <w:r>
-        <w:rPr>
-          <w:rFonts w:ascii="Consolas" w:hAnsi="Consolas"/>
-          <w:sz w:val="18"/>
-        </w:rPr>
-        <w:t>ls tools/build_quality_sample_local.py</w:t>
-      </w:r>
-    </w:p>
-    <w:p>
-      <w:pPr>
-        <w:pStyle w:val="Heading1"/>
-      </w:pPr>
-      <w:r>
-        <w:t>Part 2 — Python environment</w:t>
-      </w:r>
-    </w:p>
-    <w:p>
-      <w:r>
-        <w:rPr>
-          <w:b/>
-        </w:rPr>
-        <w:t>Create venv</w:t>
-      </w:r>
-    </w:p>
-    <w:p>
-      <w:r>
+        <w:br/>
+        <w:t>```</w:t>
+        <w:br/>
+        <w:t>python -m venv .venv</w:t>
+        <w:br/>
+        <w:t>```</w:t>
+        <w:br/>
+        <w:br/>
+        <w:t>**Activate**</w:t>
+        <w:br/>
+        <w:br/>
         <w:t>Mac / Linux:</w:t>
-      </w:r>
-    </w:p>
-    <w:p>
-      <w:pPr>
-        <w:ind w:left="216"/>
-        <w:shd w:fill="F3F4F6" w:val="clear"/>
-      </w:pPr>
-      <w:r>
-        <w:rPr>
-          <w:rFonts w:ascii="Consolas" w:hAnsi="Consolas"/>
-          <w:sz w:val="18"/>
-        </w:rPr>
-        <w:t>python3 -m venv .venv</w:t>
-      </w:r>
-    </w:p>
-    <w:p>
-      <w:r>
+        <w:br/>
+        <w:t>```</w:t>
+        <w:br/>
+        <w:t>source .venv/bin/activate</w:t>
+        <w:br/>
+        <w:t>```</w:t>
+        <w:br/>
+        <w:br/>
         <w:t>Windows:</w:t>
-      </w:r>
-    </w:p>
-    <w:p>
-      <w:pPr>
-        <w:ind w:left="216"/>
-        <w:shd w:fill="F3F4F6" w:val="clear"/>
-      </w:pPr>
-      <w:r>
-        <w:rPr>
-          <w:rFonts w:ascii="Consolas" w:hAnsi="Consolas"/>
-          <w:sz w:val="18"/>
-        </w:rPr>
-        <w:t>python -m venv .venv</w:t>
-      </w:r>
-    </w:p>
-    <w:p>
-      <w:r>
-        <w:rPr>
-          <w:b/>
-        </w:rPr>
-        <w:t>Activate</w:t>
-      </w:r>
-    </w:p>
-    <w:p>
-      <w:r>
+        <w:br/>
+        <w:t>```</w:t>
+        <w:br/>
+        <w:t>.venv\Scripts\activate</w:t>
+        <w:br/>
+        <w:t>```</w:t>
+        <w:br/>
+        <w:br/>
+        <w:t>You should see `(.venv)` at the start of the line.</w:t>
+        <w:br/>
+        <w:br/>
+        <w:t>**Install packages**</w:t>
+        <w:br/>
+        <w:br/>
+        <w:t>```</w:t>
+        <w:br/>
+        <w:t>pip install -r requirements.txt</w:t>
+        <w:br/>
+        <w:t>```</w:t>
+        <w:br/>
+        <w:br/>
+        <w:t>---</w:t>
+        <w:br/>
+        <w:br/>
+        <w:t>## Part 3 — Point at your parent folder and run</w:t>
+        <w:br/>
+        <w:br/>
+        <w:t>Your dump is any parent folder with subfolders inside:</w:t>
+        <w:br/>
+        <w:br/>
+        <w:t>```</w:t>
+        <w:br/>
+        <w:t>/path/to/company-dump/</w:t>
+        <w:br/>
+        <w:t xml:space="preserve">  Folder A/</w:t>
+        <w:br/>
+        <w:t xml:space="preserve">  Folder B/</w:t>
+        <w:br/>
+        <w:t>```</w:t>
+        <w:br/>
+        <w:br/>
+        <w:t>### Entire data of one account (recommended sample)</w:t>
+        <w:br/>
+        <w:br/>
+        <w:t>```</w:t>
+        <w:br/>
+        <w:t>python tools/build_quality_sample_local.py --root ~/Downloads/company-dump --only "Folder A" --entire</w:t>
+        <w:br/>
+        <w:t>```</w:t>
+        <w:br/>
+        <w:br/>
+        <w:t>Windows:</w:t>
+        <w:br/>
+        <w:br/>
+        <w:t>```</w:t>
+        <w:br/>
+        <w:t>python tools/build_quality_sample_local.py --root C:\Users\YourName\Downloads\company-dump --only "Folder A" --entire</w:t>
+        <w:br/>
+        <w:t>```</w:t>
+        <w:br/>
+        <w:br/>
+        <w:t>That copies **everything** under `Folder A` onto the Desktop (no 1000-file / 15GB trim).</w:t>
+        <w:br/>
+        <w:br/>
+        <w:t>### As-is until 10GB</w:t>
+        <w:br/>
+        <w:br/>
+        <w:t>```</w:t>
+        <w:br/>
+        <w:t>python tools/build_quality_sample_local.py --root ~/Downloads/company-dump --as-is</w:t>
+        <w:br/>
+        <w:t>```</w:t>
+        <w:br/>
+        <w:br/>
+        <w:t>```</w:t>
+        <w:br/>
+        <w:t>python tools/build_quality_sample_local.py --root ~/Downloads/company-dump --as-is --cap-gb 10</w:t>
+        <w:br/>
+        <w:t>```</w:t>
+        <w:br/>
+        <w:br/>
+        <w:t>### All subfolders (capped sample)</w:t>
+        <w:br/>
+        <w:br/>
+        <w:t>**Run** — replace the path with your real parent folder:</w:t>
+        <w:br/>
+        <w:br/>
         <w:t>Mac / Linux:</w:t>
-      </w:r>
-    </w:p>
-    <w:p>
-      <w:pPr>
-        <w:ind w:left="216"/>
-        <w:shd w:fill="F3F4F6" w:val="clear"/>
-      </w:pPr>
-      <w:r>
-        <w:rPr>
-          <w:rFonts w:ascii="Consolas" w:hAnsi="Consolas"/>
-          <w:sz w:val="18"/>
-        </w:rPr>
+        <w:br/>
+        <w:t>```</w:t>
+        <w:br/>
+        <w:t>python tools/build_quality_sample_local.py --root ~/Downloads/company-dump</w:t>
+        <w:br/>
+        <w:t>```</w:t>
+        <w:br/>
+        <w:br/>
+        <w:t>Windows:</w:t>
+        <w:br/>
+        <w:t>```</w:t>
+        <w:br/>
+        <w:t>python tools/build_quality_sample_local.py --root C:\Users\YourName\Downloads\company-dump</w:t>
+        <w:br/>
+        <w:t>```</w:t>
+        <w:br/>
+        <w:br/>
+        <w:t>When it finishes, open your **Desktop**. You should see:</w:t>
+        <w:br/>
+        <w:br/>
+        <w:t>```</w:t>
+        <w:br/>
+        <w:t>AI Labs Sample Set (YYYY-MM-DD)/</w:t>
+        <w:br/>
+        <w:t xml:space="preserve">  Folder A/</w:t>
+        <w:br/>
+        <w:t xml:space="preserve">  Folder B/</w:t>
+        <w:br/>
+        <w:t>```</w:t>
+        <w:br/>
+        <w:br/>
+        <w:t>A list of what was copied is also written to:</w:t>
+        <w:br/>
+        <w:br/>
+        <w:t>```</w:t>
+        <w:br/>
+        <w:t>out/quality_sample_local_manifest.json</w:t>
+        <w:br/>
+        <w:t>```</w:t>
+        <w:br/>
+        <w:br/>
+        <w:t>---</w:t>
+        <w:br/>
+        <w:br/>
+        <w:t>## Optional flags</w:t>
+        <w:br/>
+        <w:br/>
+        <w:t>**Entire data of one account (use `--entire`):**</w:t>
+        <w:br/>
+        <w:br/>
+        <w:t>```</w:t>
+        <w:br/>
+        <w:t>python tools/build_quality_sample_local.py --root ~/Downloads/company-dump --only "Folder A" --entire</w:t>
+        <w:br/>
+        <w:t>```</w:t>
+        <w:br/>
+        <w:br/>
+        <w:t>**As-is until 10GB:**</w:t>
+        <w:br/>
+        <w:br/>
+        <w:t>```</w:t>
+        <w:br/>
+        <w:t>python tools/build_quality_sample_local.py --root ~/Downloads/company-dump --as-is --cap-gb 10</w:t>
+        <w:br/>
+        <w:t>```</w:t>
+        <w:br/>
+        <w:br/>
+        <w:t>**Different per-folder first pass (default 1000 when multiple folders, then fill to 15GB):**</w:t>
+        <w:br/>
+        <w:br/>
+        <w:t>```</w:t>
+        <w:br/>
+        <w:t>python tools/build_quality_sample_local.py --root ~/Downloads/company-dump --limit 1000</w:t>
+        <w:br/>
+        <w:t>```</w:t>
+        <w:br/>
+        <w:br/>
+        <w:t>**Different overall byte cap (default 15GB for multi-folder; unlimited for one account):**</w:t>
+        <w:br/>
+        <w:br/>
+        <w:t>```</w:t>
+        <w:br/>
+        <w:t>python tools/build_quality_sample_local.py --root ~/Downloads/company-dump --cap-gb 15</w:t>
+        <w:br/>
+        <w:t>```</w:t>
+        <w:br/>
+        <w:br/>
+        <w:t>**Only some subfolders (two or more → capped sample again):**</w:t>
+        <w:br/>
+        <w:br/>
+        <w:t>```</w:t>
+        <w:br/>
+        <w:t>python tools/build_quality_sample_local.py --root ~/Downloads/company-dump --only "Folder A" "Folder B"</w:t>
+        <w:br/>
+        <w:t>```</w:t>
+        <w:br/>
+        <w:br/>
+        <w:t>**Custom destination path:**</w:t>
+        <w:br/>
+        <w:br/>
+        <w:t>```</w:t>
+        <w:br/>
+        <w:t>python tools/build_quality_sample_local.py --root ~/Downloads/company-dump --dest "~/Desktop/AI Labs Sample Set"</w:t>
+        <w:br/>
+        <w:t>```</w:t>
+        <w:br/>
+        <w:br/>
+        <w:t>**Custom name on the Desktop:**</w:t>
+        <w:br/>
+        <w:br/>
+        <w:t>```</w:t>
+        <w:br/>
+        <w:t>python tools/build_quality_sample_local.py --root ~/Downloads/company-dump --folder-name "My AI Labs Samples"</w:t>
+        <w:br/>
+        <w:t>```</w:t>
+        <w:br/>
+        <w:br/>
+        <w:t>---</w:t>
+        <w:br/>
+        <w:br/>
+        <w:t>## How “local mode” is selected</w:t>
+        <w:br/>
+        <w:br/>
+        <w:t>There is **no mode switch** inside the Drive tool.</w:t>
+        <w:br/>
+        <w:br/>
+        <w:t>| What you have | Command |</w:t>
+        <w:br/>
+        <w:t>| --- | --- |</w:t>
+        <w:br/>
+        <w:t>| Local parent folder with subfolders | `python tools/build_quality_sample_local.py --root ...` |</w:t>
+        <w:br/>
+        <w:t>| Google Drive / Workspace | `python tools/build_quality_sample.py` (see the other setup guide) |</w:t>
+        <w:br/>
+        <w:br/>
+        <w:t>Use **this** script for local. Use the other guide for Google.</w:t>
+        <w:br/>
+        <w:br/>
+        <w:t>---</w:t>
+        <w:br/>
+        <w:br/>
+        <w:t>## Troubleshooting</w:t>
+        <w:br/>
+        <w:br/>
+        <w:t>| Problem | Fix |</w:t>
+        <w:br/>
+        <w:t>| --- | --- |</w:t>
+        <w:br/>
+        <w:t>| `python: command not found` | Use `python3`, or reinstall Python with “Add to PATH” |</w:t>
+        <w:br/>
+        <w:t>| `(.venv)` not showing | Re-run the activate step in Part 2 |</w:t>
+        <w:br/>
+        <w:t>| `--root not found` | Check the path to the parent folder |</w:t>
+        <w:br/>
+        <w:t>| `no subfolders` | `--root` must contain at least one subfolder |</w:t>
+        <w:br/>
+        <w:t>| Desktop folder empty / few files | That subfolder had fewer than 1000 files, or path pointed at the wrong place |</w:t>
+        <w:br/>
+        <w:t>| Want a fresh Desktop folder | Delete or rename the old `AI Labs Sample Set (...)` folder on Desktop, then run again |</w:t>
+        <w:br/>
+        <w:br/>
+        <w:t>---</w:t>
+        <w:br/>
+        <w:br/>
+        <w:t>## Quick reference</w:t>
+        <w:br/>
+        <w:br/>
+        <w:t>```</w:t>
+        <w:br/>
+        <w:t>cd ~/inventory-segmentor</w:t>
+        <w:br/>
         <w:t>source .venv/bin/activate</w:t>
-      </w:r>
-    </w:p>
-    <w:p>
-      <w:r>
+        <w:br/>
+        <w:br/>
+        <w:t># Entire data of one account</w:t>
+        <w:br/>
+        <w:t>python tools/build_quality_sample_local.py --root ~/Downloads/company-dump --only "Folder A" --entire</w:t>
+        <w:br/>
+        <w:br/>
+        <w:t># As-is until 10GB</w:t>
+        <w:br/>
+        <w:t>python tools/build_quality_sample_local.py --root ~/Downloads/company-dump --as-is --cap-gb 10</w:t>
+        <w:br/>
+        <w:br/>
+        <w:t># Or multi-folder capped sample</w:t>
+        <w:br/>
+        <w:t>python tools/build_quality_sample_local.py --root ~/Downloads/company-dump</w:t>
+        <w:br/>
+        <w:t>```</w:t>
+        <w:br/>
+        <w:br/>
         <w:t>Windows:</w:t>
-      </w:r>
-    </w:p>
-    <w:p>
-      <w:pPr>
-        <w:ind w:left="216"/>
-        <w:shd w:fill="F3F4F6" w:val="clear"/>
-      </w:pPr>
-      <w:r>
-        <w:rPr>
-          <w:rFonts w:ascii="Consolas" w:hAnsi="Consolas"/>
-          <w:sz w:val="18"/>
-        </w:rPr>
+        <w:br/>
+        <w:t>```</w:t>
+        <w:br/>
+        <w:t>cd %USERPROFILE%\inventory-segmentor</w:t>
+        <w:br/>
         <w:t>.venv\Scripts\activate</w:t>
-      </w:r>
-    </w:p>
-    <w:p>
-      <w:r>
-        <w:t xml:space="preserve">You should see </w:t>
-      </w:r>
-      <w:r>
-        <w:rPr>
-          <w:rFonts w:ascii="Consolas" w:hAnsi="Consolas"/>
-          <w:sz w:val="20"/>
-        </w:rPr>
-        <w:t>(.venv)</w:t>
-      </w:r>
-      <w:r>
-        <w:t xml:space="preserve"> at the start of the line.</w:t>
-      </w:r>
-    </w:p>
-    <w:p>
-      <w:r>
-        <w:rPr>
-          <w:b/>
-        </w:rPr>
-        <w:t>Install packages</w:t>
-      </w:r>
-    </w:p>
-    <w:p>
-      <w:pPr>
-        <w:ind w:left="216"/>
-        <w:shd w:fill="F3F4F6" w:val="clear"/>
-      </w:pPr>
-      <w:r>
-        <w:rPr>
-          <w:rFonts w:ascii="Consolas" w:hAnsi="Consolas"/>
-          <w:sz w:val="18"/>
-        </w:rPr>
-        <w:t>pip install -r requirements.txt</w:t>
-      </w:r>
-    </w:p>
-    <w:p>
-      <w:pPr>
-        <w:pStyle w:val="Heading1"/>
-      </w:pPr>
-      <w:r>
-        <w:t>Part 3 — Point at your parent folder and run</w:t>
-      </w:r>
-    </w:p>
-    <w:p>
-      <w:r>
-        <w:t>Your dump is any parent folder with subfolders inside:</w:t>
-      </w:r>
-    </w:p>
-    <w:p>
-      <w:pPr>
-        <w:ind w:left="216"/>
-        <w:shd w:fill="F3F4F6" w:val="clear"/>
-      </w:pPr>
-      <w:r>
-        <w:rPr>
-          <w:rFonts w:ascii="Consolas" w:hAnsi="Consolas"/>
-          <w:sz w:val="18"/>
-        </w:rPr>
-        <w:t>/path/to/company-dump/</w:t>
-        <w:br/>
-        <w:t xml:space="preserve">  Folder A/</w:t>
-        <w:br/>
-        <w:t xml:space="preserve">  Folder B/</w:t>
-      </w:r>
-    </w:p>
-    <w:p>
-      <w:r>
-        <w:rPr>
-          <w:b/>
-        </w:rPr>
-        <w:t>Run</w:t>
-      </w:r>
-      <w:r>
-        <w:t xml:space="preserve"> — replace the path with your real parent folder:</w:t>
-      </w:r>
-    </w:p>
-    <w:p>
-      <w:r>
-        <w:t>Mac / Linux:</w:t>
-      </w:r>
-    </w:p>
-    <w:p>
-      <w:pPr>
-        <w:ind w:left="216"/>
-        <w:shd w:fill="F3F4F6" w:val="clear"/>
-      </w:pPr>
-      <w:r>
-        <w:rPr>
-          <w:rFonts w:ascii="Consolas" w:hAnsi="Consolas"/>
-          <w:sz w:val="18"/>
-        </w:rPr>
-        <w:t>python tools/build_quality_sample_local.py --root ~/Downloads/company-dump</w:t>
-      </w:r>
-    </w:p>
-    <w:p>
-      <w:r>
-        <w:t>Windows:</w:t>
-      </w:r>
-    </w:p>
-    <w:p>
-      <w:pPr>
-        <w:ind w:left="216"/>
-        <w:shd w:fill="F3F4F6" w:val="clear"/>
-      </w:pPr>
-      <w:r>
-        <w:rPr>
-          <w:rFonts w:ascii="Consolas" w:hAnsi="Consolas"/>
-          <w:sz w:val="18"/>
-        </w:rPr>
-        <w:t>python tools/build_quality_sample_local.py --root C:\Users\YourName\Downloads\company-dump</w:t>
-      </w:r>
-    </w:p>
-    <w:p>
-      <w:r>
-        <w:t xml:space="preserve">When it finishes, open your </w:t>
-      </w:r>
-      <w:r>
-        <w:rPr>
-          <w:b/>
-        </w:rPr>
-        <w:t>Desktop</w:t>
-      </w:r>
-      <w:r>
-        <w:t>. You should see:</w:t>
-      </w:r>
-    </w:p>
-    <w:p>
-      <w:pPr>
-        <w:ind w:left="216"/>
-        <w:shd w:fill="F3F4F6" w:val="clear"/>
-      </w:pPr>
-      <w:r>
-        <w:rPr>
-          <w:rFonts w:ascii="Consolas" w:hAnsi="Consolas"/>
-          <w:sz w:val="18"/>
-        </w:rPr>
-        <w:t>AI Labs Sample Set (YYYY-MM-DD)/</w:t>
-        <w:br/>
-        <w:t xml:space="preserve">  Folder A/</w:t>
-        <w:br/>
-        <w:t xml:space="preserve">  Folder B/</w:t>
-      </w:r>
-    </w:p>
-    <w:p>
-      <w:r>
-        <w:t>A list of what was copied is also written to:</w:t>
-      </w:r>
-    </w:p>
-    <w:p>
-      <w:pPr>
-        <w:ind w:left="216"/>
-        <w:shd w:fill="F3F4F6" w:val="clear"/>
-      </w:pPr>
-      <w:r>
-        <w:rPr>
-          <w:rFonts w:ascii="Consolas" w:hAnsi="Consolas"/>
-          <w:sz w:val="18"/>
-        </w:rPr>
-        <w:t>out/quality_sample_local_manifest.json</w:t>
-      </w:r>
-    </w:p>
-    <w:p>
-      <w:pPr>
-        <w:pStyle w:val="Heading1"/>
-      </w:pPr>
-      <w:r>
-        <w:t>Optional flags</w:t>
-      </w:r>
-    </w:p>
-    <w:p>
-      <w:r>
-        <w:rPr>
-          <w:b/>
-        </w:rPr>
-        <w:t>Different file limit (default 1000 per subfolder):</w:t>
-      </w:r>
-    </w:p>
-    <w:p>
-      <w:pPr>
-        <w:ind w:left="216"/>
-        <w:shd w:fill="F3F4F6" w:val="clear"/>
-      </w:pPr>
-      <w:r>
-        <w:rPr>
-          <w:rFonts w:ascii="Consolas" w:hAnsi="Consolas"/>
-          <w:sz w:val="18"/>
-        </w:rPr>
-        <w:t>python tools/build_quality_sample_local.py --root ~/Downloads/company-dump --limit 500</w:t>
-      </w:r>
-    </w:p>
-    <w:p>
-      <w:r>
-        <w:rPr>
-          <w:b/>
-        </w:rPr>
-        <w:t>Different byte cap (default 15GB overall):</w:t>
-      </w:r>
-    </w:p>
-    <w:p>
-      <w:pPr>
-        <w:ind w:left="216"/>
-        <w:shd w:fill="F3F4F6" w:val="clear"/>
-      </w:pPr>
-      <w:r>
-        <w:rPr>
-          <w:rFonts w:ascii="Consolas" w:hAnsi="Consolas"/>
-          <w:sz w:val="18"/>
-        </w:rPr>
-        <w:t>python tools/build_quality_sample_local.py --root ~/Downloads/company-dump --cap-gb 15</w:t>
-      </w:r>
-    </w:p>
-    <w:p>
-      <w:r>
-        <w:rPr>
-          <w:b/>
-        </w:rPr>
-        <w:t>Only some subfolders:</w:t>
-      </w:r>
-    </w:p>
-    <w:p>
-      <w:pPr>
-        <w:ind w:left="216"/>
-        <w:shd w:fill="F3F4F6" w:val="clear"/>
-      </w:pPr>
-      <w:r>
-        <w:rPr>
-          <w:rFonts w:ascii="Consolas" w:hAnsi="Consolas"/>
-          <w:sz w:val="18"/>
-        </w:rPr>
-        <w:t>python tools/build_quality_sample_local.py --root ~/Downloads/company-dump --only "Folder A" "Folder B"</w:t>
-      </w:r>
-    </w:p>
-    <w:p>
-      <w:r>
-        <w:rPr>
-          <w:b/>
-        </w:rPr>
-        <w:t>Custom destination path:</w:t>
-      </w:r>
-    </w:p>
-    <w:p>
-      <w:pPr>
-        <w:ind w:left="216"/>
-        <w:shd w:fill="F3F4F6" w:val="clear"/>
-      </w:pPr>
-      <w:r>
-        <w:rPr>
-          <w:rFonts w:ascii="Consolas" w:hAnsi="Consolas"/>
-          <w:sz w:val="18"/>
-        </w:rPr>
-        <w:t>python tools/build_quality_sample_local.py --root ~/Downloads/company-dump --dest "~/Desktop/AI Labs Sample Set"</w:t>
-      </w:r>
-    </w:p>
-    <w:p>
-      <w:r>
-        <w:rPr>
-          <w:b/>
-        </w:rPr>
-        <w:t>Custom name on the Desktop:</w:t>
-      </w:r>
-    </w:p>
-    <w:p>
-      <w:pPr>
-        <w:ind w:left="216"/>
-        <w:shd w:fill="F3F4F6" w:val="clear"/>
-      </w:pPr>
-      <w:r>
-        <w:rPr>
-          <w:rFonts w:ascii="Consolas" w:hAnsi="Consolas"/>
-          <w:sz w:val="18"/>
-        </w:rPr>
-        <w:t>python tools/build_quality_sample_local.py --root ~/Downloads/company-dump --folder-name "My AI Labs Samples"</w:t>
-      </w:r>
-    </w:p>
-    <w:p>
-      <w:pPr>
-        <w:pStyle w:val="Heading1"/>
-      </w:pPr>
-      <w:r>
-        <w:t>How “local mode” is selected</w:t>
-      </w:r>
-    </w:p>
-    <w:p>
-      <w:r>
-        <w:t xml:space="preserve">There is </w:t>
-      </w:r>
-      <w:r>
-        <w:rPr>
-          <w:b/>
-        </w:rPr>
-        <w:t>no mode switch</w:t>
-      </w:r>
-      <w:r>
-        <w:t xml:space="preserve"> inside the Drive tool.</w:t>
-      </w:r>
-    </w:p>
-    <w:tbl>
-      <w:tblPr>
-        <w:tblStyle w:val="TableGrid"/>
-        <w:tblW w:type="auto" w:w="0"/>
-        <w:tblLook w:firstColumn="1" w:firstRow="1" w:lastColumn="0" w:lastRow="0" w:noHBand="0" w:noVBand="1" w:val="04A0"/>
-      </w:tblPr>
-      <w:tblGrid>
-        <w:gridCol w:w="4896"/>
-        <w:gridCol w:w="4896"/>
-      </w:tblGrid>
-      <w:tr>
-        <w:tc>
-          <w:tcPr>
-            <w:tcW w:type="dxa" w:w="4896"/>
-          </w:tcPr>
-          <w:p>
-            <w:r>
-              <w:rPr>
-                <w:b/>
-              </w:rPr>
-            </w:r>
-            <w:r>
-              <w:rPr>
-                <w:b/>
-              </w:rPr>
-              <w:t>What you have</w:t>
-            </w:r>
-          </w:p>
-        </w:tc>
-        <w:tc>
-          <w:tcPr>
-            <w:tcW w:type="dxa" w:w="4896"/>
-          </w:tcPr>
-          <w:p>
-            <w:r>
-              <w:rPr>
-                <w:b/>
-              </w:rPr>
-            </w:r>
-            <w:r>
-              <w:rPr>
-                <w:b/>
-              </w:rPr>
-              <w:t>Command</w:t>
-            </w:r>
-          </w:p>
-        </w:tc>
-      </w:tr>
-      <w:tr>
-        <w:tc>
-          <w:tcPr>
-            <w:tcW w:type="dxa" w:w="4896"/>
-          </w:tcPr>
-          <w:p>
-            <w:r/>
-            <w:r>
-              <w:t>Local parent folder with subfolders</w:t>
-            </w:r>
-          </w:p>
-        </w:tc>
-        <w:tc>
-          <w:tcPr>
-            <w:tcW w:type="dxa" w:w="4896"/>
-          </w:tcPr>
-          <w:p>
-            <w:r/>
-            <w:r>
-              <w:rPr>
-                <w:rFonts w:ascii="Consolas" w:hAnsi="Consolas"/>
-                <w:sz w:val="20"/>
-              </w:rPr>
-              <w:t>python tools/build_quality_sample_local.py --root ...</w:t>
-            </w:r>
-          </w:p>
-        </w:tc>
-      </w:tr>
-      <w:tr>
-        <w:tc>
-          <w:tcPr>
-            <w:tcW w:type="dxa" w:w="4896"/>
-          </w:tcPr>
-          <w:p>
-            <w:r/>
-            <w:r>
-              <w:t>Google Drive / Workspace</w:t>
-            </w:r>
-          </w:p>
-        </w:tc>
-        <w:tc>
-          <w:tcPr>
-            <w:tcW w:type="dxa" w:w="4896"/>
-          </w:tcPr>
-          <w:p>
-            <w:r/>
-            <w:r>
-              <w:rPr>
-                <w:rFonts w:ascii="Consolas" w:hAnsi="Consolas"/>
-                <w:sz w:val="20"/>
-              </w:rPr>
-              <w:t>python tools/build_quality_sample.py</w:t>
-            </w:r>
-            <w:r>
-              <w:t xml:space="preserve"> (see the other setup guide)</w:t>
-            </w:r>
-          </w:p>
-        </w:tc>
-      </w:tr>
-    </w:tbl>
-    <w:p/>
-    <w:p>
-      <w:r>
-        <w:t xml:space="preserve">Use </w:t>
-      </w:r>
-      <w:r>
-        <w:rPr>
-          <w:b/>
-        </w:rPr>
-        <w:t>this</w:t>
-      </w:r>
-      <w:r>
-        <w:t xml:space="preserve"> script for local. Use the other guide for Google.</w:t>
-      </w:r>
-    </w:p>
-    <w:p>
-      <w:pPr>
-        <w:pStyle w:val="Heading1"/>
-      </w:pPr>
-      <w:r>
-        <w:t>Troubleshooting</w:t>
-      </w:r>
-    </w:p>
-    <w:tbl>
-      <w:tblPr>
-        <w:tblStyle w:val="TableGrid"/>
-        <w:tblW w:type="auto" w:w="0"/>
-        <w:tblLook w:firstColumn="1" w:firstRow="1" w:lastColumn="0" w:lastRow="0" w:noHBand="0" w:noVBand="1" w:val="04A0"/>
-      </w:tblPr>
-      <w:tblGrid>
-        <w:gridCol w:w="4896"/>
-        <w:gridCol w:w="4896"/>
-      </w:tblGrid>
-      <w:tr>
-        <w:tc>
-          <w:tcPr>
-            <w:tcW w:type="dxa" w:w="4896"/>
-          </w:tcPr>
-          <w:p>
-            <w:r>
-              <w:rPr>
-                <w:b/>
-              </w:rPr>
-            </w:r>
-            <w:r>
-              <w:rPr>
-                <w:b/>
-              </w:rPr>
-              <w:t>Problem</w:t>
-            </w:r>
-          </w:p>
-        </w:tc>
-        <w:tc>
-          <w:tcPr>
-            <w:tcW w:type="dxa" w:w="4896"/>
-          </w:tcPr>
-          <w:p>
-            <w:r>
-              <w:rPr>
-                <w:b/>
-              </w:rPr>
-            </w:r>
-            <w:r>
-              <w:rPr>
-                <w:b/>
-              </w:rPr>
-              <w:t>Fix</w:t>
-            </w:r>
-          </w:p>
-        </w:tc>
-      </w:tr>
-      <w:tr>
-        <w:tc>
-          <w:tcPr>
-            <w:tcW w:type="dxa" w:w="4896"/>
-          </w:tcPr>
-          <w:p>
-            <w:r/>
-            <w:r>
-              <w:rPr>
-                <w:rFonts w:ascii="Consolas" w:hAnsi="Consolas"/>
-                <w:sz w:val="20"/>
-              </w:rPr>
-              <w:t>python: command not found</w:t>
-            </w:r>
-          </w:p>
-        </w:tc>
-        <w:tc>
-          <w:tcPr>
-            <w:tcW w:type="dxa" w:w="4896"/>
-          </w:tcPr>
-          <w:p>
-            <w:r/>
-            <w:r>
-              <w:t xml:space="preserve">Use </w:t>
-            </w:r>
-            <w:r>
-              <w:rPr>
-                <w:rFonts w:ascii="Consolas" w:hAnsi="Consolas"/>
-                <w:sz w:val="20"/>
-              </w:rPr>
-              <w:t>python3</w:t>
-            </w:r>
-            <w:r>
-              <w:t>, or reinstall Python with “Add to PATH”</w:t>
-            </w:r>
-          </w:p>
-        </w:tc>
-      </w:tr>
-      <w:tr>
-        <w:tc>
-          <w:tcPr>
-            <w:tcW w:type="dxa" w:w="4896"/>
-          </w:tcPr>
-          <w:p>
-            <w:r/>
-            <w:r>
-              <w:rPr>
-                <w:rFonts w:ascii="Consolas" w:hAnsi="Consolas"/>
-                <w:sz w:val="20"/>
-              </w:rPr>
-              <w:t>(.venv)</w:t>
-            </w:r>
-            <w:r>
-              <w:t xml:space="preserve"> not showing</w:t>
-            </w:r>
-          </w:p>
-        </w:tc>
-        <w:tc>
-          <w:tcPr>
-            <w:tcW w:type="dxa" w:w="4896"/>
-          </w:tcPr>
-          <w:p>
-            <w:r/>
-            <w:r>
-              <w:t>Re-run the activate step in Part 2</w:t>
-            </w:r>
-          </w:p>
-        </w:tc>
-      </w:tr>
-      <w:tr>
-        <w:tc>
-          <w:tcPr>
-            <w:tcW w:type="dxa" w:w="4896"/>
-          </w:tcPr>
-          <w:p>
-            <w:r/>
-            <w:r>
-              <w:rPr>
-                <w:rFonts w:ascii="Consolas" w:hAnsi="Consolas"/>
-                <w:sz w:val="20"/>
-              </w:rPr>
-              <w:t>--root not found</w:t>
-            </w:r>
-          </w:p>
-        </w:tc>
-        <w:tc>
-          <w:tcPr>
-            <w:tcW w:type="dxa" w:w="4896"/>
-          </w:tcPr>
-          <w:p>
-            <w:r/>
-            <w:r>
-              <w:t>Check the path to the parent folder</w:t>
-            </w:r>
-          </w:p>
-        </w:tc>
-      </w:tr>
-      <w:tr>
-        <w:tc>
-          <w:tcPr>
-            <w:tcW w:type="dxa" w:w="4896"/>
-          </w:tcPr>
-          <w:p>
-            <w:r/>
-            <w:r>
-              <w:rPr>
-                <w:rFonts w:ascii="Consolas" w:hAnsi="Consolas"/>
-                <w:sz w:val="20"/>
-              </w:rPr>
-              <w:t>no subfolders</w:t>
-            </w:r>
-          </w:p>
-        </w:tc>
-        <w:tc>
-          <w:tcPr>
-            <w:tcW w:type="dxa" w:w="4896"/>
-          </w:tcPr>
-          <w:p>
-            <w:r/>
-            <w:r>
-              <w:rPr>
-                <w:rFonts w:ascii="Consolas" w:hAnsi="Consolas"/>
-                <w:sz w:val="20"/>
-              </w:rPr>
-              <w:t>--root</w:t>
-            </w:r>
-            <w:r>
-              <w:t xml:space="preserve"> must contain at least one subfolder</w:t>
-            </w:r>
-          </w:p>
-        </w:tc>
-      </w:tr>
-      <w:tr>
-        <w:tc>
-          <w:tcPr>
-            <w:tcW w:type="dxa" w:w="4896"/>
-          </w:tcPr>
-          <w:p>
-            <w:r/>
-            <w:r>
-              <w:t>Desktop folder empty / few files</w:t>
-            </w:r>
-          </w:p>
-        </w:tc>
-        <w:tc>
-          <w:tcPr>
-            <w:tcW w:type="dxa" w:w="4896"/>
-          </w:tcPr>
-          <w:p>
-            <w:r/>
-            <w:r>
-              <w:t>That subfolder had fewer than 1000 files, or path pointed at the wrong place</w:t>
-            </w:r>
-          </w:p>
-        </w:tc>
-      </w:tr>
-      <w:tr>
-        <w:tc>
-          <w:tcPr>
-            <w:tcW w:type="dxa" w:w="4896"/>
-          </w:tcPr>
-          <w:p>
-            <w:r/>
-            <w:r>
-              <w:t>Want a fresh Desktop folder</w:t>
-            </w:r>
-          </w:p>
-        </w:tc>
-        <w:tc>
-          <w:tcPr>
-            <w:tcW w:type="dxa" w:w="4896"/>
-          </w:tcPr>
-          <w:p>
-            <w:r/>
-            <w:r>
-              <w:t xml:space="preserve">Delete or rename the old </w:t>
-            </w:r>
-            <w:r>
-              <w:rPr>
-                <w:rFonts w:ascii="Consolas" w:hAnsi="Consolas"/>
-                <w:sz w:val="20"/>
-              </w:rPr>
-              <w:t>AI Labs Sample Set (...)</w:t>
-            </w:r>
-            <w:r>
-              <w:t xml:space="preserve"> folder on Desktop, then run again</w:t>
-            </w:r>
-          </w:p>
-        </w:tc>
-      </w:tr>
-    </w:tbl>
-    <w:p/>
-    <w:p>
-      <w:pPr>
-        <w:pStyle w:val="Heading1"/>
-      </w:pPr>
-      <w:r>
-        <w:t>Quick reference</w:t>
-      </w:r>
-    </w:p>
-    <w:p>
-      <w:pPr>
-        <w:ind w:left="216"/>
-        <w:shd w:fill="F3F4F6" w:val="clear"/>
-      </w:pPr>
-      <w:r>
-        <w:rPr>
-          <w:rFonts w:ascii="Consolas" w:hAnsi="Consolas"/>
-          <w:sz w:val="18"/>
-        </w:rPr>
-        <w:t>cd ~/inventory-segmentor</w:t>
-        <w:br/>
-        <w:t>source .venv/bin/activate</w:t>
-        <w:br/>
-        <w:br/>
-        <w:t>python tools/build_quality_sample_local.py --root ~/Downloads/company-dump</w:t>
-      </w:r>
-    </w:p>
-    <w:p>
-      <w:r>
-        <w:t>Windows:</w:t>
-      </w:r>
-    </w:p>
-    <w:p>
-      <w:pPr>
-        <w:ind w:left="216"/>
-        <w:shd w:fill="F3F4F6" w:val="clear"/>
-      </w:pPr>
-      <w:r>
-        <w:rPr>
-          <w:rFonts w:ascii="Consolas" w:hAnsi="Consolas"/>
-          <w:sz w:val="18"/>
-        </w:rPr>
-        <w:t>cd %USERPROFILE%\inventory-segmentor</w:t>
-        <w:br/>
-        <w:t>.venv\Scripts\activate</w:t>
-        <w:br/>
-        <w:br/>
-        <w:t>python tools/build_quality_sample_local.py --root C:\Users\YourName\Downloads\company-dump</w:t>
+        <w:br/>
+        <w:br/>
+        <w:t>python tools/build_quality_sample_local.py --root C:\Users\YourName\Downloads\company-dump --only "Folder A"</w:t>
+        <w:br/>
+        <w:t>```</w:t>
+        <w:br/>
       </w:r>
     </w:p>
     <w:sectPr>
       <w:pgSz w:w="12240" w:h="15840"/>
-      <w:pgMar w:top="1080" w:right="1224" w:bottom="1080" w:left="1224" w:header="720" w:footer="720" w:gutter="0"/>
+      <w:pgMar w:top="1440" w:right="1800" w:bottom="1440" w:left="1800" w:header="720" w:footer="720" w:gutter="0"/>
       <w:cols w:space="720"/>
       <w:docGrid w:linePitch="360"/>
     </w:sectPr>
@@ -1535,10 +852,6 @@
     <w:name w:val="Normal"/>
     <w:qFormat/>
     <w:rsid w:val="00FC693F"/>
-    <w:rPr>
-      <w:rFonts w:ascii="Calibri" w:hAnsi="Calibri"/>
-      <w:sz w:val="22"/>
-    </w:rPr>
   </w:style>
   <w:style w:type="paragraph" w:styleId="Header">
     <w:name w:val="header"/>

</xml_diff>